<commit_message>
Actualizacion de archivo LOG-02
</commit_message>
<xml_diff>
--- a/templates/LOG-026-F.docx
+++ b/templates/LOG-026-F.docx
@@ -108,6 +108,7 @@
                 <w:iCs/>
                 <w:sz w:val="22"/>
                 <w:szCs w:val="22"/>
+                <w:highlight w:val="red"/>
               </w:rPr>
             </w:pPr>
           </w:p>
@@ -126,6 +127,7 @@
                 <w:iCs/>
                 <w:sz w:val="22"/>
                 <w:szCs w:val="22"/>
+                <w:highlight w:val="red"/>
               </w:rPr>
             </w:pPr>
             <w:r>
@@ -151,6 +153,7 @@
                 <w:iCs/>
                 <w:sz w:val="22"/>
                 <w:szCs w:val="22"/>
+                <w:highlight w:val="red"/>
               </w:rPr>
             </w:pPr>
           </w:p>
@@ -199,6 +202,7 @@
                 <w:iCs/>
                 <w:sz w:val="22"/>
                 <w:szCs w:val="22"/>
+                <w:highlight w:val="red"/>
               </w:rPr>
             </w:pPr>
           </w:p>
@@ -242,6 +246,7 @@
                 <w:iCs/>
                 <w:sz w:val="22"/>
                 <w:szCs w:val="22"/>
+                <w:highlight w:val="red"/>
               </w:rPr>
             </w:pPr>
           </w:p>
@@ -1151,7 +1156,15 @@
                 <w:sz w:val="22"/>
                 <w:szCs w:val="22"/>
               </w:rPr>
-              <w:t>, se reunieron de una parte, el señor(a) _</w:t>
+              <w:t>, se reunieron de una parte, el señor(a) ____________________________________en su calidad de rector (a) y de la otra el señor</w:t>
+            </w:r>
+            <w:r>
+              <w:rPr>
+                <w:rFonts w:ascii="Verdana" w:hAnsi="Verdana" w:cs="Arial"/>
+                <w:sz w:val="22"/>
+                <w:szCs w:val="22"/>
+              </w:rPr>
+              <w:t>(a)</w:t>
             </w:r>
             <w:r>
               <w:rPr>
@@ -1166,25 +1179,9 @@
                 <w:rFonts w:ascii="Verdana" w:hAnsi="Verdana" w:cs="Arial"/>
                 <w:sz w:val="22"/>
                 <w:szCs w:val="22"/>
-              </w:rPr>
-              <w:t>___________________________________en su calidad de rector (a) y de la otra el señor</w:t>
-            </w:r>
-            <w:r>
-              <w:rPr>
-                <w:rFonts w:ascii="Verdana" w:hAnsi="Verdana" w:cs="Arial"/>
-                <w:sz w:val="22"/>
-                <w:szCs w:val="22"/>
-              </w:rPr>
-              <w:t>(</w:t>
-            </w:r>
-            <w:proofErr w:type="gramStart"/>
-            <w:r>
-              <w:rPr>
-                <w:rFonts w:ascii="Verdana" w:hAnsi="Verdana" w:cs="Arial"/>
-                <w:sz w:val="22"/>
-                <w:szCs w:val="22"/>
-              </w:rPr>
-              <w:t>a)</w:t>
+                <w:u w:val="single"/>
+              </w:rPr>
+              <w:t>YUBY CATERINE BOHÓRQUEZ ROJAS</w:t>
             </w:r>
             <w:r>
               <w:rPr>
@@ -1200,23 +1197,6 @@
                 <w:sz w:val="22"/>
                 <w:szCs w:val="22"/>
               </w:rPr>
-              <w:t xml:space="preserve"> YUBY</w:t>
-            </w:r>
-            <w:proofErr w:type="gramEnd"/>
-            <w:r>
-              <w:rPr>
-                <w:rFonts w:ascii="Verdana" w:hAnsi="Verdana" w:cs="Arial"/>
-                <w:sz w:val="22"/>
-                <w:szCs w:val="22"/>
-              </w:rPr>
-              <w:t xml:space="preserve"> CATERINE BOHÓRQUEZ ROJAS </w:t>
-            </w:r>
-            <w:r>
-              <w:rPr>
-                <w:rFonts w:ascii="Verdana" w:hAnsi="Verdana" w:cs="Arial"/>
-                <w:sz w:val="22"/>
-                <w:szCs w:val="22"/>
-              </w:rPr>
               <w:t>en su calidad de</w:t>
             </w:r>
             <w:r>
@@ -1232,35 +1212,27 @@
                 <w:rFonts w:ascii="Verdana" w:hAnsi="Verdana" w:cs="Arial"/>
                 <w:sz w:val="22"/>
                 <w:szCs w:val="22"/>
+                <w:u w:val="single"/>
               </w:rPr>
               <w:t xml:space="preserve">PROFESIONAL </w:t>
             </w:r>
-            <w:proofErr w:type="gramStart"/>
-            <w:r>
-              <w:rPr>
-                <w:rFonts w:ascii="Verdana" w:hAnsi="Verdana" w:cs="Arial"/>
-                <w:sz w:val="22"/>
-                <w:szCs w:val="22"/>
-              </w:rPr>
-              <w:t>LOGÍSTICA</w:t>
-            </w:r>
-            <w:r>
-              <w:rPr>
-                <w:rFonts w:ascii="Verdana" w:hAnsi="Verdana" w:cs="Arial"/>
-                <w:sz w:val="22"/>
-                <w:szCs w:val="22"/>
-              </w:rPr>
-              <w:t xml:space="preserve"> </w:t>
-            </w:r>
-            <w:r>
-              <w:rPr>
-                <w:rFonts w:ascii="Verdana" w:hAnsi="Verdana" w:cs="Arial"/>
-                <w:sz w:val="22"/>
-                <w:szCs w:val="22"/>
-              </w:rPr>
-              <w:t xml:space="preserve"> en</w:t>
-            </w:r>
-            <w:proofErr w:type="gramEnd"/>
+            <w:r>
+              <w:rPr>
+                <w:rFonts w:ascii="Verdana" w:hAnsi="Verdana" w:cs="Arial"/>
+                <w:sz w:val="22"/>
+                <w:szCs w:val="22"/>
+                <w:u w:val="single"/>
+              </w:rPr>
+              <w:t xml:space="preserve">LOGÍSTICA </w:t>
+            </w:r>
+            <w:r>
+              <w:rPr>
+                <w:rFonts w:ascii="Verdana" w:hAnsi="Verdana" w:cs="Arial"/>
+                <w:sz w:val="22"/>
+                <w:szCs w:val="22"/>
+              </w:rPr>
+              <w:t>en</w:t>
+            </w:r>
             <w:r>
               <w:rPr>
                 <w:rFonts w:ascii="Verdana" w:hAnsi="Verdana" w:cs="Arial"/>
@@ -2592,7 +2564,18 @@
             <w:pPr>
               <w:rPr>
                 <w:rFonts w:ascii="Verdana" w:hAnsi="Verdana"/>
-                <w:bCs/>
+                <w:b/>
+                <w:color w:val="000000"/>
+                <w:sz w:val="22"/>
+                <w:szCs w:val="22"/>
+              </w:rPr>
+            </w:pPr>
+          </w:p>
+          <w:p>
+            <w:pPr>
+              <w:rPr>
+                <w:rFonts w:ascii="Verdana" w:hAnsi="Verdana"/>
+                <w:b/>
                 <w:color w:val="000000"/>
                 <w:sz w:val="22"/>
                 <w:szCs w:val="22"/>
@@ -3002,18 +2985,17 @@
                 <w:sz w:val="22"/>
                 <w:szCs w:val="22"/>
               </w:rPr>
-              <w:lastRenderedPageBreak/>
               <w:drawing>
-                <wp:anchor distT="0" distB="0" distL="114300" distR="114300" simplePos="0" relativeHeight="251670528" behindDoc="1" locked="0" layoutInCell="1" allowOverlap="1" wp14:anchorId="6CAC8BE3" wp14:editId="1F51F1E7">
+                <wp:anchor distT="0" distB="0" distL="114300" distR="114300" simplePos="0" relativeHeight="251670528" behindDoc="0" locked="0" layoutInCell="1" allowOverlap="1" wp14:anchorId="6CAC8BE3" wp14:editId="49451E01">
                   <wp:simplePos x="0" y="0"/>
                   <wp:positionH relativeFrom="column">
-                    <wp:posOffset>381635</wp:posOffset>
+                    <wp:posOffset>508635</wp:posOffset>
                   </wp:positionH>
                   <wp:positionV relativeFrom="paragraph">
-                    <wp:posOffset>97155</wp:posOffset>
+                    <wp:posOffset>38100</wp:posOffset>
                   </wp:positionV>
-                  <wp:extent cx="1822450" cy="865505"/>
-                  <wp:effectExtent l="0" t="0" r="6350" b="0"/>
+                  <wp:extent cx="1303655" cy="619125"/>
+                  <wp:effectExtent l="0" t="0" r="0" b="9525"/>
                   <wp:wrapNone/>
                   <wp:docPr id="552010827" name="Imagen 3"/>
                   <wp:cNvGraphicFramePr>
@@ -3041,7 +3023,7 @@
                         <pic:spPr>
                           <a:xfrm>
                             <a:off x="0" y="0"/>
-                            <a:ext cx="1822450" cy="865505"/>
+                            <a:ext cx="1303655" cy="619125"/>
                           </a:xfrm>
                           <a:prstGeom prst="rect">
                             <a:avLst/>
@@ -3050,10 +3032,10 @@
                       </pic:pic>
                     </a:graphicData>
                   </a:graphic>
-                  <wp14:sizeRelH relativeFrom="page">
+                  <wp14:sizeRelH relativeFrom="margin">
                     <wp14:pctWidth>0</wp14:pctWidth>
                   </wp14:sizeRelH>
-                  <wp14:sizeRelV relativeFrom="page">
+                  <wp14:sizeRelV relativeFrom="margin">
                     <wp14:pctHeight>0</wp14:pctHeight>
                   </wp14:sizeRelV>
                 </wp:anchor>
@@ -3628,7 +3610,7 @@
                       <w:sz w:val="20"/>
                       <w:szCs w:val="20"/>
                     </w:rPr>
-                    <w:t>PROFESIONAL LOGÍSTICO</w:t>
+                    <w:t>Profesional Logístico</w:t>
                   </w:r>
                 </w:p>
               </w:tc>
@@ -4371,7 +4353,6 @@
                 <w:szCs w:val="18"/>
                 <w:lang w:val="pt-PT"/>
               </w:rPr>
-              <w:lastRenderedPageBreak/>
               <w:t>CONTROL DE CAMBIOS</w:t>
             </w:r>
           </w:p>
@@ -6646,6 +6627,16 @@
 </file>
 
 <file path=customXml/item1.xml><?xml version="1.0" encoding="utf-8"?>
+<b:Sources xmlns:b="http://schemas.openxmlformats.org/officeDocument/2006/bibliography" xmlns="http://schemas.openxmlformats.org/officeDocument/2006/bibliography" SelectedStyle="\APASixthEditionOfficeOnline.xsl" StyleName="APA" Version="6"/>
+</file>
+
+<file path=customXml/item2.xml><?xml version="1.0" encoding="utf-8"?>
+<p:properties xmlns:p="http://schemas.microsoft.com/office/2006/metadata/properties" xmlns:xsi="http://www.w3.org/2001/XMLSchema-instance" xmlns:pc="http://schemas.microsoft.com/office/infopath/2007/PartnerControls">
+  <documentManagement/>
+</p:properties>
+</file>
+
+<file path=customXml/item3.xml><?xml version="1.0" encoding="utf-8"?>
 <?mso-contentType ?>
 <FormTemplates xmlns="http://schemas.microsoft.com/sharepoint/v3/contenttype/forms">
   <Display>DocumentLibraryForm</Display>
@@ -6654,7 +6645,7 @@
 </FormTemplates>
 </file>
 
-<file path=customXml/item2.xml><?xml version="1.0" encoding="utf-8"?>
+<file path=customXml/item4.xml><?xml version="1.0" encoding="utf-8"?>
 <ct:contentTypeSchema xmlns:ct="http://schemas.microsoft.com/office/2006/metadata/contentType" xmlns:ma="http://schemas.microsoft.com/office/2006/metadata/properties/metaAttributes" ct:_="" ma:_="" ma:contentTypeName="Document" ma:contentTypeID="0x010100A30B331C4838804993200D47FCE41471" ma:contentTypeVersion="11" ma:contentTypeDescription="Create a new document." ma:contentTypeScope="" ma:versionID="d9801eb647fd58e56a8b175437891573">
   <xsd:schema xmlns:xsd="http://www.w3.org/2001/XMLSchema" xmlns:xs="http://www.w3.org/2001/XMLSchema" xmlns:p="http://schemas.microsoft.com/office/2006/metadata/properties" xmlns:ns3="2e532581-20e9-408c-a3d6-754b6c32e08b" xmlns:ns4="ab9f0e5a-eb09-4b64-a8eb-5db8af803633" targetNamespace="http://schemas.microsoft.com/office/2006/metadata/properties" ma:root="true" ma:fieldsID="c3d21b39ec3e984babe6119bab9014b0" ns3:_="" ns4:_="">
     <xsd:import namespace="2e532581-20e9-408c-a3d6-754b6c32e08b"/>
@@ -6863,17 +6854,24 @@
 </ct:contentTypeSchema>
 </file>
 
-<file path=customXml/item3.xml><?xml version="1.0" encoding="utf-8"?>
-<b:Sources xmlns:b="http://schemas.openxmlformats.org/officeDocument/2006/bibliography" xmlns="http://schemas.openxmlformats.org/officeDocument/2006/bibliography" SelectedStyle="\APASixthEditionOfficeOnline.xsl" StyleName="APA" Version="6"/>
+<file path=customXml/itemProps1.xml><?xml version="1.0" encoding="utf-8"?>
+<ds:datastoreItem xmlns:ds="http://schemas.openxmlformats.org/officeDocument/2006/customXml" ds:itemID="{273F679F-9FD1-4033-8859-4F0F279958DA}">
+  <ds:schemaRefs>
+    <ds:schemaRef ds:uri="http://schemas.openxmlformats.org/officeDocument/2006/bibliography"/>
+  </ds:schemaRefs>
+</ds:datastoreItem>
 </file>
 
-<file path=customXml/item4.xml><?xml version="1.0" encoding="utf-8"?>
-<p:properties xmlns:p="http://schemas.microsoft.com/office/2006/metadata/properties" xmlns:xsi="http://www.w3.org/2001/XMLSchema-instance" xmlns:pc="http://schemas.microsoft.com/office/infopath/2007/PartnerControls">
-  <documentManagement/>
-</p:properties>
+<file path=customXml/itemProps2.xml><?xml version="1.0" encoding="utf-8"?>
+<ds:datastoreItem xmlns:ds="http://schemas.openxmlformats.org/officeDocument/2006/customXml" ds:itemID="{8B7F66FD-9D04-4EC5-B43D-084D53B4EF9C}">
+  <ds:schemaRefs>
+    <ds:schemaRef ds:uri="http://schemas.microsoft.com/office/2006/metadata/properties"/>
+    <ds:schemaRef ds:uri="http://schemas.microsoft.com/office/infopath/2007/PartnerControls"/>
+  </ds:schemaRefs>
+</ds:datastoreItem>
 </file>
 
-<file path=customXml/itemProps1.xml><?xml version="1.0" encoding="utf-8"?>
+<file path=customXml/itemProps3.xml><?xml version="1.0" encoding="utf-8"?>
 <ds:datastoreItem xmlns:ds="http://schemas.openxmlformats.org/officeDocument/2006/customXml" ds:itemID="{0AD0403F-4538-4F35-895B-4A73F29FF4F4}">
   <ds:schemaRefs>
     <ds:schemaRef ds:uri="http://schemas.microsoft.com/sharepoint/v3/contenttype/forms"/>
@@ -6881,7 +6879,7 @@
 </ds:datastoreItem>
 </file>
 
-<file path=customXml/itemProps2.xml><?xml version="1.0" encoding="utf-8"?>
+<file path=customXml/itemProps4.xml><?xml version="1.0" encoding="utf-8"?>
 <ds:datastoreItem xmlns:ds="http://schemas.openxmlformats.org/officeDocument/2006/customXml" ds:itemID="{36349CA1-45D6-4016-A788-A8C5D419407B}">
   <ds:schemaRefs>
     <ds:schemaRef ds:uri="http://schemas.microsoft.com/office/2006/metadata/contentType"/>
@@ -6898,21 +6896,4 @@
     <ds:schemaRef ds:uri="http://schemas.microsoft.com/internal/obd"/>
   </ds:schemaRefs>
 </ds:datastoreItem>
-</file>
-
-<file path=customXml/itemProps3.xml><?xml version="1.0" encoding="utf-8"?>
-<ds:datastoreItem xmlns:ds="http://schemas.openxmlformats.org/officeDocument/2006/customXml" ds:itemID="{273F679F-9FD1-4033-8859-4F0F279958DA}">
-  <ds:schemaRefs>
-    <ds:schemaRef ds:uri="http://schemas.openxmlformats.org/officeDocument/2006/bibliography"/>
-  </ds:schemaRefs>
-</ds:datastoreItem>
-</file>
-
-<file path=customXml/itemProps4.xml><?xml version="1.0" encoding="utf-8"?>
-<ds:datastoreItem xmlns:ds="http://schemas.openxmlformats.org/officeDocument/2006/customXml" ds:itemID="{8B7F66FD-9D04-4EC5-B43D-084D53B4EF9C}">
-  <ds:schemaRefs>
-    <ds:schemaRef ds:uri="http://schemas.microsoft.com/office/2006/metadata/properties"/>
-    <ds:schemaRef ds:uri="http://schemas.microsoft.com/office/infopath/2007/PartnerControls"/>
-  </ds:schemaRefs>
-</ds:datastoreItem>
 </file>
</xml_diff>

<commit_message>
Actualizar plantilla LOG-026-F, eliminar firma beneficiario en D39-D43 de LOG-029-F, habilitar descarga de aprobados para rol CPE y actualizar carpeta raíz de Drive
</commit_message>
<xml_diff>
--- a/templates/LOG-026-F.docx
+++ b/templates/LOG-026-F.docx
@@ -2153,7 +2153,7 @@
                 <w:sz w:val="20"/>
                 <w:szCs w:val="20"/>
               </w:rPr>
-              <w:t xml:space="preserve">e tener en cuenta las siguientes excepciones para que la garantía se pueda aplicar: cuando el periodo de garantía haya expirado; sea cualquiera el tiempo transcurrido después de la fecha de terminación de la garantía; mal manejo o manipulación de las terminales efectuada por parte del usuario o de terceros no autorizados, así </w:t>
+              <w:t xml:space="preserve">e tener en cuenta las siguientes excepciones para que la garantía se pueda aplicar: </w:t>
             </w:r>
             <w:r>
               <w:rPr>
@@ -2162,7 +2162,7 @@
                 <w:szCs w:val="20"/>
               </w:rPr>
               <w:lastRenderedPageBreak/>
-              <w:t xml:space="preserve">como modificaciones o ampliaciones posteriores no incluidas en la configuración original; daños del sistema operativo ocasionados por instalación de software adicional o por utilización incorrecta del mismo; daños ocasionados por virus informáticos o pérdidas de información; todo tipo de problemas ocasionados por  instalación de periféricos o software adquiridos a terceros, que presenten incompatibilidades; daños causados por desastres naturales (rayos, terremotos) </w:t>
+              <w:t xml:space="preserve">cuando el periodo de garantía haya expirado; sea cualquiera el tiempo transcurrido después de la fecha de terminación de la garantía; mal manejo o manipulación de las terminales efectuada por parte del usuario o de terceros no autorizados, así como modificaciones o ampliaciones posteriores no incluidas en la configuración original; daños del sistema operativo ocasionados por instalación de software adicional o por utilización incorrecta del mismo; daños ocasionados por virus informáticos o pérdidas de información; todo tipo de problemas ocasionados por  instalación de periféricos o software adquiridos a terceros, que presenten incompatibilidades; daños causados por desastres naturales (rayos, terremotos) </w:t>
             </w:r>
             <w:proofErr w:type="spellStart"/>
             <w:r>
@@ -3088,9 +3088,9 @@
               <w:tblLook w:val="04A0" w:firstRow="1" w:lastRow="0" w:firstColumn="1" w:lastColumn="0" w:noHBand="0" w:noVBand="1"/>
             </w:tblPr>
             <w:tblGrid>
-              <w:gridCol w:w="4070"/>
-              <w:gridCol w:w="236"/>
-              <w:gridCol w:w="4532"/>
+              <w:gridCol w:w="4055"/>
+              <w:gridCol w:w="274"/>
+              <w:gridCol w:w="4509"/>
             </w:tblGrid>
             <w:tr>
               <w:trPr>
@@ -3500,7 +3500,6 @@
                     </w:rPr>
                   </w:pPr>
                   <w:proofErr w:type="spellStart"/>
-                  <w:proofErr w:type="gramStart"/>
                   <w:r>
                     <w:rPr>
                       <w:rFonts w:ascii="Verdana" w:hAnsi="Verdana" w:cs="Arial"/>
@@ -3518,7 +3517,6 @@
                     <w:t>ybohorquez@cpe.gov.co</w:t>
                   </w:r>
                   <w:proofErr w:type="spellEnd"/>
-                  <w:proofErr w:type="gramEnd"/>
                 </w:p>
               </w:tc>
               <w:tc>
@@ -3823,209 +3821,6 @@
                 <w:szCs w:val="22"/>
               </w:rPr>
             </w:pPr>
-            <w:r>
-              <w:rPr>
-                <w:rFonts w:ascii="Verdana" w:hAnsi="Verdana" w:cs="Arial"/>
-                <w:noProof/>
-                <w:sz w:val="22"/>
-                <w:szCs w:val="22"/>
-              </w:rPr>
-              <w:lastRenderedPageBreak/>
-              <mc:AlternateContent>
-                <mc:Choice Requires="wps">
-                  <w:drawing>
-                    <wp:anchor distT="0" distB="0" distL="114300" distR="114300" simplePos="0" relativeHeight="251668480" behindDoc="1" locked="0" layoutInCell="1" allowOverlap="1" wp14:anchorId="65BB422D" wp14:editId="32F5F223">
-                      <wp:simplePos x="0" y="0"/>
-                      <wp:positionH relativeFrom="margin">
-                        <wp:posOffset>-1905</wp:posOffset>
-                      </wp:positionH>
-                      <wp:positionV relativeFrom="margin">
-                        <wp:posOffset>822325</wp:posOffset>
-                      </wp:positionV>
-                      <wp:extent cx="3209925" cy="458470"/>
-                      <wp:effectExtent l="0" t="438150" r="0" b="434975"/>
-                      <wp:wrapTight wrapText="bothSides">
-                        <wp:wrapPolygon edited="0">
-                          <wp:start x="20521" y="-1437"/>
-                          <wp:lineTo x="14068" y="-13734"/>
-                          <wp:lineTo x="13584" y="-2136"/>
-                          <wp:lineTo x="7094" y="-13541"/>
-                          <wp:lineTo x="6610" y="-1943"/>
-                          <wp:lineTo x="818" y="-10831"/>
-                          <wp:lineTo x="260" y="2552"/>
-                          <wp:lineTo x="277" y="18181"/>
-                          <wp:lineTo x="203" y="19965"/>
-                          <wp:lineTo x="1061" y="21861"/>
-                          <wp:lineTo x="15207" y="19961"/>
-                          <wp:lineTo x="21200" y="17601"/>
-                          <wp:lineTo x="21257" y="188"/>
-                          <wp:lineTo x="20521" y="-1437"/>
-                        </wp:wrapPolygon>
-                      </wp:wrapTight>
-                      <wp:docPr id="1117866490" name="Cuadro de texto 4"/>
-                      <wp:cNvGraphicFramePr/>
-                      <a:graphic xmlns:a="http://schemas.openxmlformats.org/drawingml/2006/main">
-                        <a:graphicData uri="http://schemas.microsoft.com/office/word/2010/wordprocessingShape">
-                          <wps:wsp>
-                            <wps:cNvSpPr txBox="1"/>
-                            <wps:spPr>
-                              <a:xfrm rot="20586938">
-                                <a:off x="0" y="0"/>
-                                <a:ext cx="3209925" cy="441325"/>
-                              </a:xfrm>
-                              <a:prstGeom prst="rect">
-                                <a:avLst/>
-                              </a:prstGeom>
-                              <a:noFill/>
-                              <a:ln>
-                                <a:noFill/>
-                              </a:ln>
-                            </wps:spPr>
-                            <wps:txbx>
-                              <w:txbxContent>
-                                <w:p>
-                                  <w:pPr>
-                                    <w:rPr>
-                                      <w:rFonts w:ascii="Arial Narrow" w:hAnsi="Arial Narrow" w:cs="Arial"/>
-                                      <w:b/>
-                                      <w:color w:val="A5A5A5" w:themeColor="accent3"/>
-                                      <w:szCs w:val="72"/>
-                                      <w:lang w:val="es-CO"/>
-                                      <w14:textOutline w14:w="0" w14:cap="flat" w14:cmpd="sng" w14:algn="ctr">
-                                        <w14:noFill/>
-                                        <w14:prstDash w14:val="solid"/>
-                                        <w14:round/>
-                                      </w14:textOutline>
-                                      <w14:props3d w14:extrusionH="57150" w14:contourW="0" w14:prstMaterial="matte">
-                                        <w14:bevelT w14:w="63500" w14:h="12700" w14:prst="angle"/>
-                                        <w14:contourClr>
-                                          <w14:schemeClr w14:val="bg1">
-                                            <w14:lumMod w14:val="65000"/>
-                                          </w14:schemeClr>
-                                        </w14:contourClr>
-                                      </w14:props3d>
-                                    </w:rPr>
-                                  </w:pPr>
-                                  <w:r>
-                                    <w:rPr>
-                                      <w:rFonts w:ascii="Arial Narrow" w:hAnsi="Arial Narrow" w:cs="Arial"/>
-                                      <w:b/>
-                                      <w:color w:val="A5A5A5" w:themeColor="accent3"/>
-                                      <w:szCs w:val="72"/>
-                                      <w:lang w:val="es-CO"/>
-                                      <w14:textOutline w14:w="0" w14:cap="flat" w14:cmpd="sng" w14:algn="ctr">
-                                        <w14:noFill/>
-                                        <w14:prstDash w14:val="solid"/>
-                                        <w14:round/>
-                                      </w14:textOutline>
-                                      <w14:props3d w14:extrusionH="57150" w14:contourW="0" w14:prstMaterial="matte">
-                                        <w14:bevelT w14:w="63500" w14:h="12700" w14:prst="angle"/>
-                                        <w14:contourClr>
-                                          <w14:schemeClr w14:val="bg1">
-                                            <w14:lumMod w14:val="65000"/>
-                                          </w14:schemeClr>
-                                        </w14:contourClr>
-                                      </w14:props3d>
-                                    </w:rPr>
-                                    <w:t>PANORAMICA SEDE EDUCATIVA (nombre de la sede)</w:t>
-                                  </w:r>
-                                </w:p>
-                              </w:txbxContent>
-                            </wps:txbx>
-                            <wps:bodyPr rot="0" spcFirstLastPara="0" vertOverflow="clip" horzOverflow="clip" vert="horz" wrap="square" lIns="91440" tIns="45720" rIns="91440" bIns="45720" numCol="1" spcCol="0" rtlCol="0" fromWordArt="0" anchor="t" anchorCtr="0" forceAA="0" compatLnSpc="1">
-                              <a:prstTxWarp prst="textNoShape">
-                                <a:avLst/>
-                              </a:prstTxWarp>
-                              <a:spAutoFit/>
-                              <a:scene3d>
-                                <a:camera prst="orthographicFront"/>
-                                <a:lightRig rig="harsh" dir="t"/>
-                              </a:scene3d>
-                              <a:sp3d extrusionH="57150" prstMaterial="matte">
-                                <a:bevelT w="63500" h="12700" prst="angle"/>
-                                <a:contourClr>
-                                  <a:schemeClr val="bg1">
-                                    <a:lumMod val="65000"/>
-                                  </a:schemeClr>
-                                </a:contourClr>
-                              </a:sp3d>
-                            </wps:bodyPr>
-                          </wps:wsp>
-                        </a:graphicData>
-                      </a:graphic>
-                      <wp14:sizeRelH relativeFrom="margin">
-                        <wp14:pctWidth>0</wp14:pctWidth>
-                      </wp14:sizeRelH>
-                      <wp14:sizeRelV relativeFrom="margin">
-                        <wp14:pctHeight>0</wp14:pctHeight>
-                      </wp14:sizeRelV>
-                    </wp:anchor>
-                  </w:drawing>
-                </mc:Choice>
-                <mc:Fallback>
-                  <w:pict>
-                    <v:shapetype w14:anchorId="65BB422D" id="_x0000_t202" coordsize="21600,21600" o:spt="202" path="m,l,21600r21600,l21600,xe">
-                      <v:stroke joinstyle="miter"/>
-                      <v:path gradientshapeok="t" o:connecttype="rect"/>
-                    </v:shapetype>
-                    <v:shape id="Cuadro de texto 4" o:spid="_x0000_s1026" type="#_x0000_t202" style="position:absolute;margin-left:-.15pt;margin-top:64.75pt;width:252.75pt;height:36.1pt;rotation:-1106534fd;z-index:-251648000;visibility:visible;mso-wrap-style:square;mso-width-percent:0;mso-height-percent:0;mso-wrap-distance-left:9pt;mso-wrap-distance-top:0;mso-wrap-distance-right:9pt;mso-wrap-distance-bottom:0;mso-position-horizontal:absolute;mso-position-horizontal-relative:margin;mso-position-vertical:absolute;mso-position-vertical-relative:margin;mso-width-percent:0;mso-height-percent:0;mso-width-relative:margin;mso-height-relative:margin;v-text-anchor:top" o:gfxdata="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" filled="f" stroked="f">
-                      <v:textbox style="mso-fit-shape-to-text:t">
-                        <w:txbxContent>
-                          <w:p>
-                            <w:pPr>
-                              <w:rPr>
-                                <w:rFonts w:ascii="Arial Narrow" w:hAnsi="Arial Narrow" w:cs="Arial"/>
-                                <w:b/>
-                                <w:color w:val="A5A5A5" w:themeColor="accent3"/>
-                                <w:szCs w:val="72"/>
-                                <w:lang w:val="es-CO"/>
-                                <w14:textOutline w14:w="0" w14:cap="flat" w14:cmpd="sng" w14:algn="ctr">
-                                  <w14:noFill/>
-                                  <w14:prstDash w14:val="solid"/>
-                                  <w14:round/>
-                                </w14:textOutline>
-                                <w14:props3d w14:extrusionH="57150" w14:contourW="0" w14:prstMaterial="matte">
-                                  <w14:bevelT w14:w="63500" w14:h="12700" w14:prst="angle"/>
-                                  <w14:contourClr>
-                                    <w14:schemeClr w14:val="bg1">
-                                      <w14:lumMod w14:val="65000"/>
-                                    </w14:schemeClr>
-                                  </w14:contourClr>
-                                </w14:props3d>
-                              </w:rPr>
-                            </w:pPr>
-                            <w:r>
-                              <w:rPr>
-                                <w:rFonts w:ascii="Arial Narrow" w:hAnsi="Arial Narrow" w:cs="Arial"/>
-                                <w:b/>
-                                <w:color w:val="A5A5A5" w:themeColor="accent3"/>
-                                <w:szCs w:val="72"/>
-                                <w:lang w:val="es-CO"/>
-                                <w14:textOutline w14:w="0" w14:cap="flat" w14:cmpd="sng" w14:algn="ctr">
-                                  <w14:noFill/>
-                                  <w14:prstDash w14:val="solid"/>
-                                  <w14:round/>
-                                </w14:textOutline>
-                                <w14:props3d w14:extrusionH="57150" w14:contourW="0" w14:prstMaterial="matte">
-                                  <w14:bevelT w14:w="63500" w14:h="12700" w14:prst="angle"/>
-                                  <w14:contourClr>
-                                    <w14:schemeClr w14:val="bg1">
-                                      <w14:lumMod w14:val="65000"/>
-                                    </w14:schemeClr>
-                                  </w14:contourClr>
-                                </w14:props3d>
-                              </w:rPr>
-                              <w:t>PANORAMICA SEDE EDUCATIVA (nombre de la sede)</w:t>
-                            </w:r>
-                          </w:p>
-                        </w:txbxContent>
-                      </v:textbox>
-                      <w10:wrap type="tight" anchorx="margin" anchory="margin"/>
-                    </v:shape>
-                  </w:pict>
-                </mc:Fallback>
-              </mc:AlternateContent>
-            </w:r>
           </w:p>
         </w:tc>
         <w:tc>
@@ -4049,207 +3844,6 @@
                 <w:szCs w:val="22"/>
               </w:rPr>
             </w:pPr>
-            <w:r>
-              <w:rPr>
-                <w:rFonts w:ascii="Verdana" w:hAnsi="Verdana" w:cs="Arial"/>
-                <w:noProof/>
-                <w:sz w:val="22"/>
-                <w:szCs w:val="22"/>
-              </w:rPr>
-              <mc:AlternateContent>
-                <mc:Choice Requires="wps">
-                  <w:drawing>
-                    <wp:anchor distT="0" distB="0" distL="114300" distR="114300" simplePos="0" relativeHeight="251669504" behindDoc="1" locked="0" layoutInCell="1" allowOverlap="1" wp14:anchorId="5BE6A37E" wp14:editId="5736BD96">
-                      <wp:simplePos x="0" y="0"/>
-                      <wp:positionH relativeFrom="margin">
-                        <wp:posOffset>153035</wp:posOffset>
-                      </wp:positionH>
-                      <wp:positionV relativeFrom="margin">
-                        <wp:posOffset>-93980</wp:posOffset>
-                      </wp:positionV>
-                      <wp:extent cx="3209925" cy="825500"/>
-                      <wp:effectExtent l="0" t="419100" r="0" b="427990"/>
-                      <wp:wrapTight wrapText="bothSides">
-                        <wp:wrapPolygon edited="0">
-                          <wp:start x="20457" y="-551"/>
-                          <wp:lineTo x="14004" y="-7410"/>
-                          <wp:lineTo x="13409" y="552"/>
-                          <wp:lineTo x="6908" y="-7454"/>
-                          <wp:lineTo x="6312" y="509"/>
-                          <wp:lineTo x="915" y="-6137"/>
-                          <wp:lineTo x="196" y="1674"/>
-                          <wp:lineTo x="231" y="19109"/>
-                          <wp:lineTo x="120" y="20602"/>
-                          <wp:lineTo x="978" y="21659"/>
-                          <wp:lineTo x="15775" y="20857"/>
-                          <wp:lineTo x="21154" y="18785"/>
-                          <wp:lineTo x="21643" y="6886"/>
-                          <wp:lineTo x="21316" y="506"/>
-                          <wp:lineTo x="20457" y="-551"/>
-                        </wp:wrapPolygon>
-                      </wp:wrapTight>
-                      <wp:docPr id="2017711319" name="Cuadro de texto 3"/>
-                      <wp:cNvGraphicFramePr/>
-                      <a:graphic xmlns:a="http://schemas.openxmlformats.org/drawingml/2006/main">
-                        <a:graphicData uri="http://schemas.microsoft.com/office/word/2010/wordprocessingShape">
-                          <wps:wsp>
-                            <wps:cNvSpPr txBox="1"/>
-                            <wps:spPr>
-                              <a:xfrm rot="20586938">
-                                <a:off x="0" y="0"/>
-                                <a:ext cx="3209925" cy="791210"/>
-                              </a:xfrm>
-                              <a:prstGeom prst="rect">
-                                <a:avLst/>
-                              </a:prstGeom>
-                              <a:noFill/>
-                              <a:ln>
-                                <a:noFill/>
-                              </a:ln>
-                            </wps:spPr>
-                            <wps:txbx>
-                              <w:txbxContent>
-                                <w:p>
-                                  <w:pPr>
-                                    <w:jc w:val="center"/>
-                                    <w:rPr>
-                                      <w:rFonts w:ascii="Arial Narrow" w:hAnsi="Arial Narrow" w:cs="Arial"/>
-                                      <w:b/>
-                                      <w:color w:val="A5A5A5" w:themeColor="accent3"/>
-                                      <w:szCs w:val="72"/>
-                                      <w:lang w:val="es-CO"/>
-                                      <w14:textOutline w14:w="0" w14:cap="flat" w14:cmpd="sng" w14:algn="ctr">
-                                        <w14:noFill/>
-                                        <w14:prstDash w14:val="solid"/>
-                                        <w14:round/>
-                                      </w14:textOutline>
-                                      <w14:props3d w14:extrusionH="57150" w14:contourW="0" w14:prstMaterial="matte">
-                                        <w14:bevelT w14:w="63500" w14:h="12700" w14:prst="angle"/>
-                                        <w14:contourClr>
-                                          <w14:schemeClr w14:val="bg1">
-                                            <w14:lumMod w14:val="65000"/>
-                                          </w14:schemeClr>
-                                        </w14:contourClr>
-                                      </w14:props3d>
-                                    </w:rPr>
-                                  </w:pPr>
-                                  <w:r>
-                                    <w:rPr>
-                                      <w:rFonts w:ascii="Arial Narrow" w:hAnsi="Arial Narrow" w:cs="Arial"/>
-                                      <w:b/>
-                                      <w:color w:val="A5A5A5" w:themeColor="accent3"/>
-                                      <w:szCs w:val="72"/>
-                                      <w:lang w:val="es-CO"/>
-                                      <w14:textOutline w14:w="0" w14:cap="flat" w14:cmpd="sng" w14:algn="ctr">
-                                        <w14:noFill/>
-                                        <w14:prstDash w14:val="solid"/>
-                                        <w14:round/>
-                                      </w14:textOutline>
-                                      <w14:props3d w14:extrusionH="57150" w14:contourW="0" w14:prstMaterial="matte">
-                                        <w14:bevelT w14:w="63500" w14:h="12700" w14:prst="angle"/>
-                                        <w14:contourClr>
-                                          <w14:schemeClr w14:val="bg1">
-                                            <w14:lumMod w14:val="65000"/>
-                                          </w14:schemeClr>
-                                        </w14:contourClr>
-                                      </w14:props3d>
-                                    </w:rPr>
-                                    <w:t>Elementos entregados (Dispositivos encendidos y contextualizar el espacio destinado para resguardar los elementos.)</w:t>
-                                  </w:r>
-                                </w:p>
-                              </w:txbxContent>
-                            </wps:txbx>
-                            <wps:bodyPr rot="0" spcFirstLastPara="0" vertOverflow="clip" horzOverflow="clip" vert="horz" wrap="square" lIns="91440" tIns="45720" rIns="91440" bIns="45720" numCol="1" spcCol="0" rtlCol="0" fromWordArt="0" anchor="t" anchorCtr="0" forceAA="0" compatLnSpc="1">
-                              <a:prstTxWarp prst="textNoShape">
-                                <a:avLst/>
-                              </a:prstTxWarp>
-                              <a:spAutoFit/>
-                              <a:scene3d>
-                                <a:camera prst="orthographicFront"/>
-                                <a:lightRig rig="harsh" dir="t"/>
-                              </a:scene3d>
-                              <a:sp3d extrusionH="57150" prstMaterial="matte">
-                                <a:bevelT w="63500" h="12700" prst="angle"/>
-                                <a:contourClr>
-                                  <a:schemeClr val="bg1">
-                                    <a:lumMod val="65000"/>
-                                  </a:schemeClr>
-                                </a:contourClr>
-                              </a:sp3d>
-                            </wps:bodyPr>
-                          </wps:wsp>
-                        </a:graphicData>
-                      </a:graphic>
-                      <wp14:sizeRelH relativeFrom="margin">
-                        <wp14:pctWidth>0</wp14:pctWidth>
-                      </wp14:sizeRelH>
-                      <wp14:sizeRelV relativeFrom="margin">
-                        <wp14:pctHeight>0</wp14:pctHeight>
-                      </wp14:sizeRelV>
-                    </wp:anchor>
-                  </w:drawing>
-                </mc:Choice>
-                <mc:Fallback>
-                  <w:pict>
-                    <v:shape w14:anchorId="5BE6A37E" id="Cuadro de texto 3" o:spid="_x0000_s1027" type="#_x0000_t202" style="position:absolute;margin-left:12.05pt;margin-top:-7.4pt;width:252.75pt;height:65pt;rotation:-1106534fd;z-index:-251646976;visibility:visible;mso-wrap-style:square;mso-width-percent:0;mso-height-percent:0;mso-wrap-distance-left:9pt;mso-wrap-distance-top:0;mso-wrap-distance-right:9pt;mso-wrap-distance-bottom:0;mso-position-horizontal:absolute;mso-position-horizontal-relative:margin;mso-position-vertical:absolute;mso-position-vertical-relative:margin;mso-width-percent:0;mso-height-percent:0;mso-width-relative:margin;mso-height-relative:margin;v-text-anchor:top" o:gfxdata="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" filled="f" stroked="f">
-                      <v:textbox style="mso-fit-shape-to-text:t">
-                        <w:txbxContent>
-                          <w:p>
-                            <w:pPr>
-                              <w:jc w:val="center"/>
-                              <w:rPr>
-                                <w:rFonts w:ascii="Arial Narrow" w:hAnsi="Arial Narrow" w:cs="Arial"/>
-                                <w:b/>
-                                <w:color w:val="A5A5A5" w:themeColor="accent3"/>
-                                <w:szCs w:val="72"/>
-                                <w:lang w:val="es-CO"/>
-                                <w14:textOutline w14:w="0" w14:cap="flat" w14:cmpd="sng" w14:algn="ctr">
-                                  <w14:noFill/>
-                                  <w14:prstDash w14:val="solid"/>
-                                  <w14:round/>
-                                </w14:textOutline>
-                                <w14:props3d w14:extrusionH="57150" w14:contourW="0" w14:prstMaterial="matte">
-                                  <w14:bevelT w14:w="63500" w14:h="12700" w14:prst="angle"/>
-                                  <w14:contourClr>
-                                    <w14:schemeClr w14:val="bg1">
-                                      <w14:lumMod w14:val="65000"/>
-                                    </w14:schemeClr>
-                                  </w14:contourClr>
-                                </w14:props3d>
-                              </w:rPr>
-                            </w:pPr>
-                            <w:r>
-                              <w:rPr>
-                                <w:rFonts w:ascii="Arial Narrow" w:hAnsi="Arial Narrow" w:cs="Arial"/>
-                                <w:b/>
-                                <w:color w:val="A5A5A5" w:themeColor="accent3"/>
-                                <w:szCs w:val="72"/>
-                                <w:lang w:val="es-CO"/>
-                                <w14:textOutline w14:w="0" w14:cap="flat" w14:cmpd="sng" w14:algn="ctr">
-                                  <w14:noFill/>
-                                  <w14:prstDash w14:val="solid"/>
-                                  <w14:round/>
-                                </w14:textOutline>
-                                <w14:props3d w14:extrusionH="57150" w14:contourW="0" w14:prstMaterial="matte">
-                                  <w14:bevelT w14:w="63500" w14:h="12700" w14:prst="angle"/>
-                                  <w14:contourClr>
-                                    <w14:schemeClr w14:val="bg1">
-                                      <w14:lumMod w14:val="65000"/>
-                                    </w14:schemeClr>
-                                  </w14:contourClr>
-                                </w14:props3d>
-                              </w:rPr>
-                              <w:t>Elementos entregados (Dispositivos encendidos y contextualizar el espacio destinado para resguardar los elementos.)</w:t>
-                            </w:r>
-                          </w:p>
-                        </w:txbxContent>
-                      </v:textbox>
-                      <w10:wrap type="tight" anchorx="margin" anchory="margin"/>
-                    </v:shape>
-                  </w:pict>
-                </mc:Fallback>
-              </mc:AlternateContent>
-            </w:r>
           </w:p>
         </w:tc>
       </w:tr>
@@ -4302,10 +3896,10 @@
         <w:tblLook w:val="04A0" w:firstRow="1" w:lastRow="0" w:firstColumn="1" w:lastColumn="0" w:noHBand="0" w:noVBand="1"/>
       </w:tblPr>
       <w:tblGrid>
-        <w:gridCol w:w="1697"/>
-        <w:gridCol w:w="1647"/>
-        <w:gridCol w:w="5471"/>
-        <w:gridCol w:w="23"/>
+        <w:gridCol w:w="1716"/>
+        <w:gridCol w:w="1666"/>
+        <w:gridCol w:w="5436"/>
+        <w:gridCol w:w="20"/>
       </w:tblGrid>
       <w:tr>
         <w:trPr>
@@ -5287,8 +4881,8 @@
       <w:tblLook w:val="0000" w:firstRow="0" w:lastRow="0" w:firstColumn="0" w:lastColumn="0" w:noHBand="0" w:noVBand="0"/>
     </w:tblPr>
     <w:tblGrid>
-      <w:gridCol w:w="1559"/>
-      <w:gridCol w:w="1884"/>
+      <w:gridCol w:w="1900"/>
+      <w:gridCol w:w="2297"/>
     </w:tblGrid>
     <w:tr>
       <w:trPr>
@@ -6617,15 +6211,16 @@
 </file>
 
 <file path=customXml/item1.xml><?xml version="1.0" encoding="utf-8"?>
-<?mso-contentType ?>
-<FormTemplates xmlns="http://schemas.microsoft.com/sharepoint/v3/contenttype/forms">
-  <Display>DocumentLibraryForm</Display>
-  <Edit>DocumentLibraryForm</Edit>
-  <New>DocumentLibraryForm</New>
-</FormTemplates>
+<p:properties xmlns:p="http://schemas.microsoft.com/office/2006/metadata/properties" xmlns:xsi="http://www.w3.org/2001/XMLSchema-instance" xmlns:pc="http://schemas.microsoft.com/office/infopath/2007/PartnerControls">
+  <documentManagement/>
+</p:properties>
 </file>
 
 <file path=customXml/item2.xml><?xml version="1.0" encoding="utf-8"?>
+<b:Sources xmlns:b="http://schemas.openxmlformats.org/officeDocument/2006/bibliography" xmlns="http://schemas.openxmlformats.org/officeDocument/2006/bibliography" SelectedStyle="\APASixthEditionOfficeOnline.xsl" StyleName="APA" Version="6"/>
+</file>
+
+<file path=customXml/item3.xml><?xml version="1.0" encoding="utf-8"?>
 <ct:contentTypeSchema xmlns:ct="http://schemas.microsoft.com/office/2006/metadata/contentType" xmlns:ma="http://schemas.microsoft.com/office/2006/metadata/properties/metaAttributes" ct:_="" ma:_="" ma:contentTypeName="Document" ma:contentTypeID="0x010100A30B331C4838804993200D47FCE41471" ma:contentTypeVersion="11" ma:contentTypeDescription="Create a new document." ma:contentTypeScope="" ma:versionID="d9801eb647fd58e56a8b175437891573">
   <xsd:schema xmlns:xsd="http://www.w3.org/2001/XMLSchema" xmlns:xs="http://www.w3.org/2001/XMLSchema" xmlns:p="http://schemas.microsoft.com/office/2006/metadata/properties" xmlns:ns3="2e532581-20e9-408c-a3d6-754b6c32e08b" xmlns:ns4="ab9f0e5a-eb09-4b64-a8eb-5db8af803633" targetNamespace="http://schemas.microsoft.com/office/2006/metadata/properties" ma:root="true" ma:fieldsID="c3d21b39ec3e984babe6119bab9014b0" ns3:_="" ns4:_="">
     <xsd:import namespace="2e532581-20e9-408c-a3d6-754b6c32e08b"/>
@@ -6834,25 +6429,33 @@
 </ct:contentTypeSchema>
 </file>
 
-<file path=customXml/item3.xml><?xml version="1.0" encoding="utf-8"?>
-<b:Sources xmlns:b="http://schemas.openxmlformats.org/officeDocument/2006/bibliography" xmlns="http://schemas.openxmlformats.org/officeDocument/2006/bibliography" SelectedStyle="\APASixthEditionOfficeOnline.xsl" StyleName="APA" Version="6"/>
-</file>
-
 <file path=customXml/item4.xml><?xml version="1.0" encoding="utf-8"?>
-<p:properties xmlns:p="http://schemas.microsoft.com/office/2006/metadata/properties" xmlns:xsi="http://www.w3.org/2001/XMLSchema-instance" xmlns:pc="http://schemas.microsoft.com/office/infopath/2007/PartnerControls">
-  <documentManagement/>
-</p:properties>
+<?mso-contentType ?>
+<FormTemplates xmlns="http://schemas.microsoft.com/sharepoint/v3/contenttype/forms">
+  <Display>DocumentLibraryForm</Display>
+  <Edit>DocumentLibraryForm</Edit>
+  <New>DocumentLibraryForm</New>
+</FormTemplates>
 </file>
 
 <file path=customXml/itemProps1.xml><?xml version="1.0" encoding="utf-8"?>
-<ds:datastoreItem xmlns:ds="http://schemas.openxmlformats.org/officeDocument/2006/customXml" ds:itemID="{0AD0403F-4538-4F35-895B-4A73F29FF4F4}">
+<ds:datastoreItem xmlns:ds="http://schemas.openxmlformats.org/officeDocument/2006/customXml" ds:itemID="{8B7F66FD-9D04-4EC5-B43D-084D53B4EF9C}">
   <ds:schemaRefs>
-    <ds:schemaRef ds:uri="http://schemas.microsoft.com/sharepoint/v3/contenttype/forms"/>
+    <ds:schemaRef ds:uri="http://schemas.microsoft.com/office/2006/metadata/properties"/>
+    <ds:schemaRef ds:uri="http://schemas.microsoft.com/office/infopath/2007/PartnerControls"/>
   </ds:schemaRefs>
 </ds:datastoreItem>
 </file>
 
 <file path=customXml/itemProps2.xml><?xml version="1.0" encoding="utf-8"?>
+<ds:datastoreItem xmlns:ds="http://schemas.openxmlformats.org/officeDocument/2006/customXml" ds:itemID="{273F679F-9FD1-4033-8859-4F0F279958DA}">
+  <ds:schemaRefs>
+    <ds:schemaRef ds:uri="http://schemas.openxmlformats.org/officeDocument/2006/bibliography"/>
+  </ds:schemaRefs>
+</ds:datastoreItem>
+</file>
+
+<file path=customXml/itemProps3.xml><?xml version="1.0" encoding="utf-8"?>
 <ds:datastoreItem xmlns:ds="http://schemas.openxmlformats.org/officeDocument/2006/customXml" ds:itemID="{36349CA1-45D6-4016-A788-A8C5D419407B}">
   <ds:schemaRefs>
     <ds:schemaRef ds:uri="http://schemas.microsoft.com/office/2006/metadata/contentType"/>
@@ -6871,19 +6474,10 @@
 </ds:datastoreItem>
 </file>
 
-<file path=customXml/itemProps3.xml><?xml version="1.0" encoding="utf-8"?>
-<ds:datastoreItem xmlns:ds="http://schemas.openxmlformats.org/officeDocument/2006/customXml" ds:itemID="{273F679F-9FD1-4033-8859-4F0F279958DA}">
+<file path=customXml/itemProps4.xml><?xml version="1.0" encoding="utf-8"?>
+<ds:datastoreItem xmlns:ds="http://schemas.openxmlformats.org/officeDocument/2006/customXml" ds:itemID="{0AD0403F-4538-4F35-895B-4A73F29FF4F4}">
   <ds:schemaRefs>
-    <ds:schemaRef ds:uri="http://schemas.openxmlformats.org/officeDocument/2006/bibliography"/>
-  </ds:schemaRefs>
-</ds:datastoreItem>
-</file>
-
-<file path=customXml/itemProps4.xml><?xml version="1.0" encoding="utf-8"?>
-<ds:datastoreItem xmlns:ds="http://schemas.openxmlformats.org/officeDocument/2006/customXml" ds:itemID="{8B7F66FD-9D04-4EC5-B43D-084D53B4EF9C}">
-  <ds:schemaRefs>
-    <ds:schemaRef ds:uri="http://schemas.microsoft.com/office/2006/metadata/properties"/>
-    <ds:schemaRef ds:uri="http://schemas.microsoft.com/office/infopath/2007/PartnerControls"/>
+    <ds:schemaRef ds:uri="http://schemas.microsoft.com/sharepoint/v3/contenttype/forms"/>
   </ds:schemaRefs>
 </ds:datastoreItem>
 </file>
</xml_diff>